<commit_message>
SSLC QB access request: disclose ERP/MRP evaluation use (consent-based)
</commit_message>
<xml_diff>
--- a/drafts/SSLC_QuickBooks_Full_Access_Request_DRAFT_2026-10-10.docx
+++ b/drafts/SSLC_QuickBooks_Full_Access_Request_DRAFT_2026-10-10.docx
@@ -119,6 +119,11 @@
           <w:b w:val="0"/>
         </w:rPr>
         <w:t>As a director I have the right to inspect SSLC's books and records (Cal. Corp. Code § 1602: https://codes.findlaw.com/ca/corporations-code/corp-sect-1602/). This review is also part of the confirmatory diligence contemplated under our May 2025 Asset Acquisition Agreement. All information stays confidential under our July 27, 2021 NDA.</w:t>
+      </w:r>
+    </w:p>
+    <w:p>
+      <w:r>
+        <w:t>In the interest of full disclosure: with the Board's consent, Exos would also like to use the same books data to evaluate its in-house ERP/MRP and inventory systems against other options for the combined operation. Because these systems are built in-house, they could offer significant savings compared with outside solutions. This use is separate from the review above. It would happen only if the Board agrees, and the data would stay confidential under our NDA.</w:t>
       </w:r>
     </w:p>
     <w:p>

</xml_diff>

<commit_message>
SSLC board package: add Motion 3 (AR Unbilled correction), renumber ERP→Motion 4, four-motions everywhere, QB letter sentence, cover rebuild
- Slide 11: insert Motion 3 (direct A La Carte + Singer Lewak / Welch & Co. to reconcile Acct 1110 AR Unbilled $942K + Acct 2380 Deposits $120K within 5 days, tank-by-tank recon IM-109/122/134 EXOS-133 + corrected BS to all directors); renumber ERP/MRP consent → Motion 4
- Slides 2 + 12: 'three motions' → 'four motions'; Motion 1–4 listed in detail box; 'Motions 1–3' → '1–4'
- QB access letter: add sentence re: Board directing accounting firm to correct accounts within 5 days
- Board package cover: updated contents description to reference four motions
- Board package (v4): cover + 12-slide deck + offer summary + clean QB letter (17pp)
- Grep validation: zero banned strings (198K / 198419 / cancel / 864062 / 864K / 'three motions' / 'Motions 1–3')
</commit_message>
<xml_diff>
--- a/drafts/SSLC_QuickBooks_Full_Access_Request_DRAFT_2026-10-10.docx
+++ b/drafts/SSLC_QuickBooks_Full_Access_Request_DRAFT_2026-10-10.docx
@@ -132,6 +132,14 @@
           <w:b w:val="0"/>
         </w:rPr>
         <w:t>Could you grant access no later than October 15, 2026? Once the balance is reconciled, I'll share the analysis with the full board so we can agree on the figures at close.</w:t>
+      </w:r>
+    </w:p>
+    <w:p>
+      <w:r>
+        <w:rPr>
+          <w:b w:val="0"/>
+        </w:rPr>
+        <w:t>I have also asked the Board to direct SSLC’s accounting firm to correct these accounts within five days.</w:t>
       </w:r>
     </w:p>
     <w:p>

</xml_diff>

<commit_message>
SSLC Motion 2: add cap table / stock ledger requirement; QB letter matching bullet
- Slide 11 Motion 2: add 2-line requirement for SSLC to provide stock ledger, cap table, subscription agreements, and paid-in capital by shareholder ($1,014,465 total per books; per-holder detail needed for payout-vs-invested comparison at close); Oct 15 deadline applies to these records too
- QB access letter: add matching bullet (para 14) with same language
- Deck pptx v12, deck PDF v7, QB letter v2, board package v2 (17pp)
</commit_message>
<xml_diff>
--- a/drafts/SSLC_QuickBooks_Full_Access_Request_DRAFT_2026-10-10.docx
+++ b/drafts/SSLC_QuickBooks_Full_Access_Request_DRAFT_2026-10-10.docx
@@ -111,6 +111,14 @@
       </w:pPr>
       <w:r>
         <w:t>Facility expenses (rent, utilities and similar) since January 2024, including amounts paid on behalf of Microcosm, Inc.</w:t>
+      </w:r>
+    </w:p>
+    <w:p>
+      <w:pPr>
+        <w:pStyle w:val="ListBullet"/>
+      </w:pPr>
+      <w:r>
+        <w:t>SSLC’s stock ledger, cap table, subscription agreements and paid-in capital by shareholder (SSLC’s books show $1,014,465 total paid-in capital; we need the per-holder detail to compare each shareholder’s payout at close with what they invested)</w:t>
       </w:r>
     </w:p>
     <w:p>

</xml_diff>